<commit_message>
added software algorithm diagrams
</commit_message>
<xml_diff>
--- a/documentation.docx
+++ b/documentation.docx
@@ -108,21 +108,7 @@
         <w:rPr>
           <w:lang w:val="bg-BG"/>
         </w:rPr>
-        <w:t xml:space="preserve">сигналните и </w:t>
-      </w:r>
-      <w:proofErr w:type="spellStart"/>
-      <w:r>
-        <w:rPr>
-          <w:lang w:val="bg-BG"/>
-        </w:rPr>
-        <w:t>осушителни</w:t>
-      </w:r>
-      <w:proofErr w:type="spellEnd"/>
-      <w:r>
-        <w:rPr>
-          <w:lang w:val="bg-BG"/>
-        </w:rPr>
-        <w:t xml:space="preserve"> средства с които са об</w:t>
+        <w:t>сигналните и осушителни средства с които са об</w:t>
       </w:r>
       <w:r>
         <w:rPr>
@@ -1830,14 +1816,12 @@
       <w:r>
         <w:t>(</w:t>
       </w:r>
-      <w:proofErr w:type="spellStart"/>
       <w:r>
         <w:rPr>
           <w:lang w:val="bg-BG"/>
         </w:rPr>
         <w:t>фиг</w:t>
       </w:r>
-      <w:proofErr w:type="spellEnd"/>
       <w:r>
         <w:t xml:space="preserve">. </w:t>
       </w:r>
@@ -2402,7 +2386,6 @@
                 <w:lang w:val="bg-BG"/>
               </w:rPr>
             </w:pPr>
-            <w:proofErr w:type="spellStart"/>
             <w:r>
               <w:rPr>
                 <w:b/>
@@ -2411,31 +2394,8 @@
                 <w:szCs w:val="20"/>
                 <w:lang w:val="bg-BG"/>
               </w:rPr>
-              <w:t>Cellular</w:t>
+              <w:t>Cellular networks</w:t>
             </w:r>
-            <w:proofErr w:type="spellEnd"/>
-            <w:r>
-              <w:rPr>
-                <w:b/>
-                <w:bCs/>
-                <w:sz w:val="20"/>
-                <w:szCs w:val="20"/>
-                <w:lang w:val="bg-BG"/>
-              </w:rPr>
-              <w:t xml:space="preserve"> </w:t>
-            </w:r>
-            <w:proofErr w:type="spellStart"/>
-            <w:r>
-              <w:rPr>
-                <w:b/>
-                <w:bCs/>
-                <w:sz w:val="20"/>
-                <w:szCs w:val="20"/>
-                <w:lang w:val="bg-BG"/>
-              </w:rPr>
-              <w:t>networks</w:t>
-            </w:r>
-            <w:proofErr w:type="spellEnd"/>
           </w:p>
         </w:tc>
         <w:tc>
@@ -2460,7 +2420,6 @@
                 <w:lang w:val="bg-BG"/>
               </w:rPr>
             </w:pPr>
-            <w:proofErr w:type="spellStart"/>
             <w:r>
               <w:rPr>
                 <w:b/>
@@ -2471,7 +2430,6 @@
               </w:rPr>
               <w:t>LPWANs</w:t>
             </w:r>
-            <w:proofErr w:type="spellEnd"/>
           </w:p>
         </w:tc>
         <w:tc>
@@ -2504,42 +2462,8 @@
                 <w:szCs w:val="20"/>
                 <w:lang w:val="bg-BG"/>
               </w:rPr>
-              <w:t xml:space="preserve">M2M </w:t>
+              <w:t>M2M connected devices</w:t>
             </w:r>
-            <w:proofErr w:type="spellStart"/>
-            <w:r>
-              <w:rPr>
-                <w:b/>
-                <w:bCs/>
-                <w:sz w:val="20"/>
-                <w:szCs w:val="20"/>
-                <w:lang w:val="bg-BG"/>
-              </w:rPr>
-              <w:t>connected</w:t>
-            </w:r>
-            <w:proofErr w:type="spellEnd"/>
-            <w:r>
-              <w:rPr>
-                <w:b/>
-                <w:bCs/>
-                <w:sz w:val="20"/>
-                <w:szCs w:val="20"/>
-                <w:lang w:val="bg-BG"/>
-              </w:rPr>
-              <w:t xml:space="preserve"> </w:t>
-            </w:r>
-            <w:proofErr w:type="spellStart"/>
-            <w:r>
-              <w:rPr>
-                <w:b/>
-                <w:bCs/>
-                <w:sz w:val="20"/>
-                <w:szCs w:val="20"/>
-                <w:lang w:val="bg-BG"/>
-              </w:rPr>
-              <w:t>devices</w:t>
-            </w:r>
-            <w:proofErr w:type="spellEnd"/>
           </w:p>
         </w:tc>
         <w:tc>
@@ -2564,7 +2488,6 @@
                 <w:lang w:val="bg-BG"/>
               </w:rPr>
             </w:pPr>
-            <w:proofErr w:type="spellStart"/>
             <w:r>
               <w:rPr>
                 <w:b/>
@@ -2573,84 +2496,7 @@
                 <w:szCs w:val="20"/>
                 <w:lang w:val="bg-BG"/>
               </w:rPr>
-              <w:t>Augmented</w:t>
-            </w:r>
-            <w:proofErr w:type="spellEnd"/>
-            <w:r>
-              <w:rPr>
-                <w:b/>
-                <w:bCs/>
-                <w:sz w:val="20"/>
-                <w:szCs w:val="20"/>
-                <w:lang w:val="bg-BG"/>
-              </w:rPr>
-              <w:t xml:space="preserve"> </w:t>
-            </w:r>
-            <w:proofErr w:type="spellStart"/>
-            <w:r>
-              <w:rPr>
-                <w:b/>
-                <w:bCs/>
-                <w:sz w:val="20"/>
-                <w:szCs w:val="20"/>
-                <w:lang w:val="bg-BG"/>
-              </w:rPr>
-              <w:t>Reality</w:t>
-            </w:r>
-            <w:proofErr w:type="spellEnd"/>
-            <w:r>
-              <w:rPr>
-                <w:b/>
-                <w:bCs/>
-                <w:sz w:val="20"/>
-                <w:szCs w:val="20"/>
-                <w:lang w:val="bg-BG"/>
-              </w:rPr>
-              <w:t xml:space="preserve"> (AR) and </w:t>
-            </w:r>
-            <w:proofErr w:type="spellStart"/>
-            <w:r>
-              <w:rPr>
-                <w:b/>
-                <w:bCs/>
-                <w:sz w:val="20"/>
-                <w:szCs w:val="20"/>
-                <w:lang w:val="bg-BG"/>
-              </w:rPr>
-              <w:t>Virtual</w:t>
-            </w:r>
-            <w:proofErr w:type="spellEnd"/>
-            <w:r>
-              <w:rPr>
-                <w:b/>
-                <w:bCs/>
-                <w:sz w:val="20"/>
-                <w:szCs w:val="20"/>
-                <w:lang w:val="bg-BG"/>
-              </w:rPr>
-              <w:t xml:space="preserve"> </w:t>
-            </w:r>
-            <w:proofErr w:type="spellStart"/>
-            <w:r>
-              <w:rPr>
-                <w:b/>
-                <w:bCs/>
-                <w:sz w:val="20"/>
-                <w:szCs w:val="20"/>
-                <w:lang w:val="bg-BG"/>
-              </w:rPr>
-              <w:t>Reality</w:t>
-            </w:r>
-            <w:proofErr w:type="spellEnd"/>
-            <w:r>
-              <w:rPr>
-                <w:b/>
-                <w:bCs/>
-                <w:sz w:val="20"/>
-                <w:szCs w:val="20"/>
-                <w:lang w:val="bg-BG"/>
-              </w:rPr>
-              <w:t xml:space="preserve"> (VR)</w:t>
+              <w:t>Augmented Reality (AR) and Virtual Reality (VR)</w:t>
             </w:r>
           </w:p>
         </w:tc>
@@ -2676,7 +2522,6 @@
                 <w:lang w:val="bg-BG"/>
               </w:rPr>
             </w:pPr>
-            <w:proofErr w:type="spellStart"/>
             <w:r>
               <w:rPr>
                 <w:b/>
@@ -2685,40 +2530,7 @@
                 <w:szCs w:val="20"/>
                 <w:lang w:val="bg-BG"/>
               </w:rPr>
-              <w:t>Bluetooth</w:t>
-            </w:r>
-            <w:proofErr w:type="spellEnd"/>
-            <w:r>
-              <w:rPr>
-                <w:b/>
-                <w:bCs/>
-                <w:sz w:val="20"/>
-                <w:szCs w:val="20"/>
-                <w:lang w:val="bg-BG"/>
-              </w:rPr>
-              <w:t xml:space="preserve"> and </w:t>
-            </w:r>
-            <w:proofErr w:type="spellStart"/>
-            <w:r>
-              <w:rPr>
-                <w:b/>
-                <w:bCs/>
-                <w:sz w:val="20"/>
-                <w:szCs w:val="20"/>
-                <w:lang w:val="bg-BG"/>
-              </w:rPr>
-              <w:t>other</w:t>
-            </w:r>
-            <w:proofErr w:type="spellEnd"/>
-            <w:r>
-              <w:rPr>
-                <w:b/>
-                <w:bCs/>
-                <w:sz w:val="20"/>
-                <w:szCs w:val="20"/>
-                <w:lang w:val="bg-BG"/>
-              </w:rPr>
-              <w:t xml:space="preserve"> BLE</w:t>
+              <w:t>Bluetooth and other BLE</w:t>
             </w:r>
           </w:p>
         </w:tc>
@@ -2778,7 +2590,6 @@
                 <w:lang w:val="bg-BG"/>
               </w:rPr>
             </w:pPr>
-            <w:proofErr w:type="spellStart"/>
             <w:r>
               <w:rPr>
                 <w:b/>
@@ -2787,75 +2598,8 @@
                 <w:szCs w:val="20"/>
                 <w:lang w:val="bg-BG"/>
               </w:rPr>
-              <w:t>Mesh</w:t>
+              <w:t>Mesh protocols like Zigbee</w:t>
             </w:r>
-            <w:proofErr w:type="spellEnd"/>
-            <w:r>
-              <w:rPr>
-                <w:b/>
-                <w:bCs/>
-                <w:sz w:val="20"/>
-                <w:szCs w:val="20"/>
-                <w:lang w:val="bg-BG"/>
-              </w:rPr>
-              <w:t xml:space="preserve"> </w:t>
-            </w:r>
-            <w:proofErr w:type="spellStart"/>
-            <w:r>
-              <w:rPr>
-                <w:b/>
-                <w:bCs/>
-                <w:sz w:val="20"/>
-                <w:szCs w:val="20"/>
-                <w:lang w:val="bg-BG"/>
-              </w:rPr>
-              <w:t>protocols</w:t>
-            </w:r>
-            <w:proofErr w:type="spellEnd"/>
-            <w:r>
-              <w:rPr>
-                <w:b/>
-                <w:bCs/>
-                <w:sz w:val="20"/>
-                <w:szCs w:val="20"/>
-                <w:lang w:val="bg-BG"/>
-              </w:rPr>
-              <w:t xml:space="preserve"> </w:t>
-            </w:r>
-            <w:proofErr w:type="spellStart"/>
-            <w:r>
-              <w:rPr>
-                <w:b/>
-                <w:bCs/>
-                <w:sz w:val="20"/>
-                <w:szCs w:val="20"/>
-                <w:lang w:val="bg-BG"/>
-              </w:rPr>
-              <w:t>like</w:t>
-            </w:r>
-            <w:proofErr w:type="spellEnd"/>
-            <w:r>
-              <w:rPr>
-                <w:b/>
-                <w:bCs/>
-                <w:sz w:val="20"/>
-                <w:szCs w:val="20"/>
-                <w:lang w:val="bg-BG"/>
-              </w:rPr>
-              <w:t xml:space="preserve"> </w:t>
-            </w:r>
-            <w:proofErr w:type="spellStart"/>
-            <w:r>
-              <w:rPr>
-                <w:b/>
-                <w:bCs/>
-                <w:sz w:val="20"/>
-                <w:szCs w:val="20"/>
-                <w:lang w:val="bg-BG"/>
-              </w:rPr>
-              <w:t>Zigbee</w:t>
-            </w:r>
-            <w:proofErr w:type="spellEnd"/>
           </w:p>
         </w:tc>
       </w:tr>
@@ -2934,25 +2678,7 @@
                 <w:szCs w:val="18"/>
                 <w:lang w:val="bg-BG"/>
               </w:rPr>
-              <w:t xml:space="preserve">Устройствата, използващи LPWAN, могат да се свързват с всички </w:t>
-            </w:r>
-            <w:proofErr w:type="spellStart"/>
-            <w:r>
-              <w:rPr>
-                <w:sz w:val="18"/>
-                <w:szCs w:val="18"/>
-                <w:lang w:val="bg-BG"/>
-              </w:rPr>
-              <w:t>IoT</w:t>
-            </w:r>
-            <w:proofErr w:type="spellEnd"/>
-            <w:r>
-              <w:rPr>
-                <w:sz w:val="18"/>
-                <w:szCs w:val="18"/>
-                <w:lang w:val="bg-BG"/>
-              </w:rPr>
-              <w:t xml:space="preserve"> сензори. Следователно можете да г</w:t>
+              <w:t>Устройствата, използващи LPWAN, могат да се свързват с всички IoT сензори. Следователно можете да г</w:t>
             </w:r>
             <w:r>
               <w:rPr>
@@ -3067,25 +2793,7 @@
                 <w:szCs w:val="18"/>
                 <w:lang w:val="bg-BG"/>
               </w:rPr>
-              <w:t xml:space="preserve">Фабриките използват машини, поддържащи </w:t>
-            </w:r>
-            <w:proofErr w:type="spellStart"/>
-            <w:r>
-              <w:rPr>
-                <w:sz w:val="18"/>
-                <w:szCs w:val="18"/>
-                <w:lang w:val="bg-BG"/>
-              </w:rPr>
-              <w:t>IoT</w:t>
-            </w:r>
-            <w:proofErr w:type="spellEnd"/>
-            <w:r>
-              <w:rPr>
-                <w:sz w:val="18"/>
-                <w:szCs w:val="18"/>
-                <w:lang w:val="bg-BG"/>
-              </w:rPr>
-              <w:t>, за да изпълняват задачи по-</w:t>
+              <w:t>Фабриките използват машини, поддържащи IoT, за да изпълняват задачи по-</w:t>
             </w:r>
             <w:r>
               <w:rPr>
@@ -3101,25 +2809,7 @@
                 <w:szCs w:val="18"/>
                 <w:lang w:val="bg-BG"/>
               </w:rPr>
-              <w:t xml:space="preserve">, а не по-трудно. Машините имат сензори, позволяващи на потребителите да проследяват износването, да наблюдават работното натоварване, изхода и входа и т.н. Фабричните цехове се автоматизират благодарение на безжичните </w:t>
-            </w:r>
-            <w:proofErr w:type="spellStart"/>
-            <w:r>
-              <w:rPr>
-                <w:sz w:val="18"/>
-                <w:szCs w:val="18"/>
-                <w:lang w:val="bg-BG"/>
-              </w:rPr>
-              <w:t>IoT</w:t>
-            </w:r>
-            <w:proofErr w:type="spellEnd"/>
-            <w:r>
-              <w:rPr>
-                <w:sz w:val="18"/>
-                <w:szCs w:val="18"/>
-                <w:lang w:val="bg-BG"/>
-              </w:rPr>
-              <w:t xml:space="preserve"> технологии.</w:t>
+              <w:t>, а не по-трудно. Машините имат сензори, позволяващи на потребителите да проследяват износването, да наблюдават работното натоварване, изхода и входа и т.н. Фабричните цехове се автоматизират благодарение на безжичните IoT технологии.</w:t>
             </w:r>
           </w:p>
         </w:tc>
@@ -3151,25 +2841,7 @@
                 <w:szCs w:val="18"/>
                 <w:lang w:val="bg-BG"/>
               </w:rPr>
-              <w:t xml:space="preserve">С </w:t>
-            </w:r>
-            <w:proofErr w:type="spellStart"/>
-            <w:r>
-              <w:rPr>
-                <w:sz w:val="18"/>
-                <w:szCs w:val="18"/>
-                <w:lang w:val="bg-BG"/>
-              </w:rPr>
-              <w:t>IoT</w:t>
-            </w:r>
-            <w:proofErr w:type="spellEnd"/>
-            <w:r>
-              <w:rPr>
-                <w:sz w:val="18"/>
-                <w:szCs w:val="18"/>
-                <w:lang w:val="bg-BG"/>
-              </w:rPr>
-              <w:t xml:space="preserve"> устройствата можете да използвате информация от реалния свят и да ги наслагвате с помощта на AR/VR. Потребителите са поставени в дигиталния свят и използват заснети човешки движения, за да се потопят в този свят.</w:t>
+              <w:t>С IoT устройствата можете да използвате информация от реалния свят и да ги наслагвате с помощта на AR/VR. Потребителите са поставени в дигиталния свят и използват заснети човешки движения, за да се потопят в този свят.</w:t>
             </w:r>
           </w:p>
         </w:tc>
@@ -3195,23 +2867,13 @@
                 <w:lang w:val="bg-BG"/>
               </w:rPr>
             </w:pPr>
-            <w:proofErr w:type="spellStart"/>
             <w:r>
               <w:rPr>
                 <w:sz w:val="18"/>
                 <w:szCs w:val="18"/>
                 <w:lang w:val="bg-BG"/>
               </w:rPr>
-              <w:t>Bluetooth</w:t>
-            </w:r>
-            <w:proofErr w:type="spellEnd"/>
-            <w:r>
-              <w:rPr>
-                <w:sz w:val="18"/>
-                <w:szCs w:val="18"/>
-                <w:lang w:val="bg-BG"/>
-              </w:rPr>
-              <w:t xml:space="preserve"> е под WPAN (</w:t>
+              <w:t>Bluetooth е под WPAN (</w:t>
             </w:r>
             <w:r>
               <w:rPr>
@@ -3226,25 +2888,7 @@
                 <w:szCs w:val="18"/>
                 <w:lang w:val="bg-BG"/>
               </w:rPr>
-              <w:t xml:space="preserve">). Разширен до BLE, той се прилага най-добре в малки потребителски </w:t>
-            </w:r>
-            <w:proofErr w:type="spellStart"/>
-            <w:r>
-              <w:rPr>
-                <w:sz w:val="18"/>
-                <w:szCs w:val="18"/>
-                <w:lang w:val="bg-BG"/>
-              </w:rPr>
-              <w:t>IoT</w:t>
-            </w:r>
-            <w:proofErr w:type="spellEnd"/>
-            <w:r>
-              <w:rPr>
-                <w:sz w:val="18"/>
-                <w:szCs w:val="18"/>
-                <w:lang w:val="bg-BG"/>
-              </w:rPr>
-              <w:t xml:space="preserve"> приложения. Те се използват в </w:t>
+              <w:t xml:space="preserve">). Разширен до BLE, той се прилага най-добре в малки потребителски IoT приложения. Те се използват в </w:t>
             </w:r>
             <w:r>
               <w:rPr>
@@ -3319,25 +2963,7 @@
                 <w:szCs w:val="18"/>
                 <w:lang w:val="bg-BG"/>
               </w:rPr>
-              <w:t xml:space="preserve"> домове като уреди и охранителни камери. Не е подходящ за индустриалния сектор на </w:t>
-            </w:r>
-            <w:proofErr w:type="spellStart"/>
-            <w:r>
-              <w:rPr>
-                <w:sz w:val="18"/>
-                <w:szCs w:val="18"/>
-                <w:lang w:val="bg-BG"/>
-              </w:rPr>
-              <w:t>IoT</w:t>
-            </w:r>
-            <w:proofErr w:type="spellEnd"/>
-            <w:r>
-              <w:rPr>
-                <w:sz w:val="18"/>
-                <w:szCs w:val="18"/>
-                <w:lang w:val="bg-BG"/>
-              </w:rPr>
-              <w:t>.</w:t>
+              <w:t xml:space="preserve"> домове като уреди и охранителни камери. Не е подходящ за индустриалния сектор на IoT.</w:t>
             </w:r>
           </w:p>
           <w:p>
@@ -3396,25 +3022,7 @@
                 <w:szCs w:val="18"/>
                 <w:lang w:val="bg-BG"/>
               </w:rPr>
-              <w:t xml:space="preserve">. Те допълват </w:t>
-            </w:r>
-            <w:proofErr w:type="spellStart"/>
-            <w:r>
-              <w:rPr>
-                <w:sz w:val="18"/>
-                <w:szCs w:val="18"/>
-                <w:lang w:val="bg-BG"/>
-              </w:rPr>
-              <w:t>Wi-Fi</w:t>
-            </w:r>
-            <w:proofErr w:type="spellEnd"/>
-            <w:r>
-              <w:rPr>
-                <w:sz w:val="18"/>
-                <w:szCs w:val="18"/>
-                <w:lang w:val="bg-BG"/>
-              </w:rPr>
-              <w:t>, за да подобрят умните домове</w:t>
+              <w:t>. Те допълват Wi-Fi, за да подобрят умните домове</w:t>
             </w:r>
           </w:p>
           <w:p>
@@ -3594,7 +3202,6 @@
                 <w:lang w:val="bg-BG"/>
               </w:rPr>
             </w:pPr>
-            <w:proofErr w:type="spellStart"/>
             <w:r>
               <w:rPr>
                 <w:b/>
@@ -3605,7 +3212,6 @@
               </w:rPr>
               <w:t>LoRa</w:t>
             </w:r>
-            <w:proofErr w:type="spellEnd"/>
           </w:p>
         </w:tc>
         <w:tc>
@@ -3640,20 +3246,8 @@
                 <w:szCs w:val="20"/>
                 <w:lang w:val="bg-BG"/>
               </w:rPr>
-              <w:t>NB-</w:t>
+              <w:t>NB-IoT</w:t>
             </w:r>
-            <w:proofErr w:type="spellStart"/>
-            <w:r>
-              <w:rPr>
-                <w:b/>
-                <w:bCs/>
-                <w:sz w:val="20"/>
-                <w:szCs w:val="20"/>
-                <w:lang w:val="bg-BG"/>
-              </w:rPr>
-              <w:t>IoT</w:t>
-            </w:r>
-            <w:proofErr w:type="spellEnd"/>
           </w:p>
         </w:tc>
         <w:tc>
@@ -3680,7 +3274,6 @@
                 <w:lang w:val="bg-BG"/>
               </w:rPr>
             </w:pPr>
-            <w:proofErr w:type="spellStart"/>
             <w:r>
               <w:rPr>
                 <w:b/>
@@ -3691,7 +3284,6 @@
               </w:rPr>
               <w:t>SigFox</w:t>
             </w:r>
-            <w:proofErr w:type="spellEnd"/>
           </w:p>
         </w:tc>
         <w:tc>
@@ -3837,25 +3429,7 @@
                 <w:szCs w:val="18"/>
                 <w:lang w:val="bg-BG"/>
               </w:rPr>
-              <w:t>-</w:t>
-            </w:r>
-            <w:proofErr w:type="spellStart"/>
-            <w:r>
-              <w:rPr>
-                <w:sz w:val="18"/>
-                <w:szCs w:val="18"/>
-                <w:lang w:val="bg-BG"/>
-              </w:rPr>
-              <w:t>LoRa</w:t>
-            </w:r>
-            <w:proofErr w:type="spellEnd"/>
-            <w:r>
-              <w:rPr>
-                <w:sz w:val="18"/>
-                <w:szCs w:val="18"/>
-                <w:lang w:val="bg-BG"/>
-              </w:rPr>
-              <w:t xml:space="preserve"> устройствата работят без </w:t>
+              <w:t xml:space="preserve">-LoRa устройствата работят без </w:t>
             </w:r>
             <w:r>
               <w:rPr>
@@ -3890,25 +3464,7 @@
                 <w:szCs w:val="18"/>
                 <w:lang w:val="bg-BG"/>
               </w:rPr>
-              <w:t xml:space="preserve">-Устройствата, използващи технологията </w:t>
-            </w:r>
-            <w:proofErr w:type="spellStart"/>
-            <w:r>
-              <w:rPr>
-                <w:sz w:val="18"/>
-                <w:szCs w:val="18"/>
-                <w:lang w:val="bg-BG"/>
-              </w:rPr>
-              <w:t>LoRa</w:t>
-            </w:r>
-            <w:proofErr w:type="spellEnd"/>
-            <w:r>
-              <w:rPr>
-                <w:sz w:val="18"/>
-                <w:szCs w:val="18"/>
-                <w:lang w:val="bg-BG"/>
-              </w:rPr>
-              <w:t>, имат удължен/дълъг живот на батерията</w:t>
+              <w:t>-Устройствата, използващи технологията LoRa, имат удължен/дълъг живот на батерията</w:t>
             </w:r>
           </w:p>
           <w:p>
@@ -3927,25 +3483,7 @@
                 <w:szCs w:val="18"/>
                 <w:lang w:val="bg-BG"/>
               </w:rPr>
-              <w:t xml:space="preserve">-Поддържа </w:t>
-            </w:r>
-            <w:proofErr w:type="spellStart"/>
-            <w:r>
-              <w:rPr>
-                <w:sz w:val="18"/>
-                <w:szCs w:val="18"/>
-                <w:lang w:val="bg-BG"/>
-              </w:rPr>
-              <w:t>двупосочност</w:t>
-            </w:r>
-            <w:proofErr w:type="spellEnd"/>
-            <w:r>
-              <w:rPr>
-                <w:sz w:val="18"/>
-                <w:szCs w:val="18"/>
-                <w:lang w:val="bg-BG"/>
-              </w:rPr>
-              <w:t>, като например функционалност</w:t>
+              <w:t>-Поддържа двупосочност, като например функционалност</w:t>
             </w:r>
             <w:r>
               <w:rPr>
@@ -4040,25 +3578,7 @@
                 <w:szCs w:val="18"/>
                 <w:lang w:val="bg-BG"/>
               </w:rPr>
-              <w:t>-Устройствата, използващи NB-</w:t>
-            </w:r>
-            <w:proofErr w:type="spellStart"/>
-            <w:r>
-              <w:rPr>
-                <w:sz w:val="18"/>
-                <w:szCs w:val="18"/>
-                <w:lang w:val="bg-BG"/>
-              </w:rPr>
-              <w:t>IoT</w:t>
-            </w:r>
-            <w:proofErr w:type="spellEnd"/>
-            <w:r>
-              <w:rPr>
-                <w:sz w:val="18"/>
-                <w:szCs w:val="18"/>
-                <w:lang w:val="bg-BG"/>
-              </w:rPr>
-              <w:t>, зависят от 4G покритие и следователно работят добре дълбоко на закрито и гъсти градски центрове.</w:t>
+              <w:t>-Устройствата, използващи NB-IoT, зависят от 4G покритие и следователно работят добре дълбоко на закрито и гъсти градски центрове.</w:t>
             </w:r>
           </w:p>
           <w:p>
@@ -4861,14 +4381,7 @@
         <w:rPr>
           <w:lang w:val="bg-BG"/>
         </w:rPr>
-        <w:t xml:space="preserve"> режим на нормална работа модулът ще бъде захранван от стандартните </w:t>
-      </w:r>
-      <w:proofErr w:type="spellStart"/>
-      <w:r>
-        <w:rPr>
-          <w:lang w:val="bg-BG"/>
-        </w:rPr>
-        <w:t>токои</w:t>
+        <w:t xml:space="preserve"> режим на нормална работа модулът ще бъде захранван от стандартните токои</w:t>
       </w:r>
       <w:r>
         <w:rPr>
@@ -4880,14 +4393,7 @@
         <w:rPr>
           <w:lang w:val="bg-BG"/>
         </w:rPr>
-        <w:t>точници</w:t>
-      </w:r>
-      <w:proofErr w:type="spellEnd"/>
-      <w:r>
-        <w:rPr>
-          <w:lang w:val="bg-BG"/>
-        </w:rPr>
-        <w:t xml:space="preserve"> на лодката (двигател, соларни панели, ветрогенератор, акум</w:t>
+        <w:t>точници на лодката (двигател, соларни панели, ветрогенератор, акум</w:t>
       </w:r>
       <w:r>
         <w:rPr>
@@ -4899,21 +4405,7 @@
         <w:rPr>
           <w:lang w:val="bg-BG"/>
         </w:rPr>
-        <w:t xml:space="preserve">латори) като същевременно ще държи на </w:t>
-      </w:r>
-      <w:proofErr w:type="spellStart"/>
-      <w:r>
-        <w:rPr>
-          <w:lang w:val="bg-BG"/>
-        </w:rPr>
-        <w:t>подзарядка</w:t>
-      </w:r>
-      <w:proofErr w:type="spellEnd"/>
-      <w:r>
-        <w:rPr>
-          <w:lang w:val="bg-BG"/>
-        </w:rPr>
-        <w:t xml:space="preserve"> собствената си акум</w:t>
+        <w:t>латори) като същевременно ще държи на подзарядка собствената си акум</w:t>
       </w:r>
       <w:r>
         <w:rPr>
@@ -5125,14 +4617,12 @@
       <w:r>
         <w:t>(</w:t>
       </w:r>
-      <w:proofErr w:type="spellStart"/>
       <w:r>
         <w:rPr>
           <w:lang w:val="bg-BG"/>
         </w:rPr>
         <w:t>фиг</w:t>
       </w:r>
-      <w:proofErr w:type="spellEnd"/>
       <w:r>
         <w:t xml:space="preserve">. </w:t>
       </w:r>
@@ -5166,14 +4656,12 @@
       <w:r>
         <w:t>(</w:t>
       </w:r>
-      <w:proofErr w:type="spellStart"/>
       <w:r>
         <w:rPr>
           <w:lang w:val="bg-BG"/>
         </w:rPr>
         <w:t>фиг</w:t>
       </w:r>
-      <w:proofErr w:type="spellEnd"/>
       <w:r>
         <w:t xml:space="preserve">. </w:t>
       </w:r>
@@ -5460,14 +4948,12 @@
       <w:r>
         <w:t>(</w:t>
       </w:r>
-      <w:proofErr w:type="spellStart"/>
       <w:r>
         <w:rPr>
           <w:lang w:val="bg-BG"/>
         </w:rPr>
         <w:t>фиг</w:t>
       </w:r>
-      <w:proofErr w:type="spellEnd"/>
       <w:r>
         <w:t xml:space="preserve">. </w:t>
       </w:r>
@@ -5495,14 +4981,12 @@
       <w:r>
         <w:t>(</w:t>
       </w:r>
-      <w:proofErr w:type="spellStart"/>
       <w:r>
         <w:rPr>
           <w:lang w:val="bg-BG"/>
         </w:rPr>
         <w:t>фиг</w:t>
       </w:r>
-      <w:proofErr w:type="spellEnd"/>
       <w:r>
         <w:t xml:space="preserve">. </w:t>
       </w:r>
@@ -5966,16 +5450,8 @@
         <w:rPr>
           <w:lang w:val="bg-BG"/>
         </w:rPr>
-        <w:t xml:space="preserve">мачта тип </w:t>
-      </w:r>
-      <w:proofErr w:type="spellStart"/>
-      <w:r>
-        <w:rPr>
-          <w:lang w:val="bg-BG"/>
-        </w:rPr>
-        <w:t>ролл</w:t>
-      </w:r>
-      <w:proofErr w:type="spellEnd"/>
+        <w:t>мачта тип ролл</w:t>
+      </w:r>
       <w:r>
         <w:rPr>
           <w:lang w:val="bg-BG"/>
@@ -5986,21 +5462,7 @@
         <w:rPr>
           <w:lang w:val="bg-BG"/>
         </w:rPr>
-        <w:t xml:space="preserve">бар характерна за </w:t>
-      </w:r>
-      <w:proofErr w:type="spellStart"/>
-      <w:r>
-        <w:rPr>
-          <w:lang w:val="bg-BG"/>
-        </w:rPr>
-        <w:t>рибовети</w:t>
-      </w:r>
-      <w:proofErr w:type="spellEnd"/>
-      <w:r>
-        <w:rPr>
-          <w:lang w:val="bg-BG"/>
-        </w:rPr>
-        <w:t xml:space="preserve"> и малките пластмасови лодки</w:t>
+        <w:t>бар характерна за рибовети и малките пластмасови лодки</w:t>
       </w:r>
       <w:r>
         <w:rPr>
@@ -6450,14 +5912,7 @@
         <w:rPr>
           <w:lang w:val="bg-BG"/>
         </w:rPr>
-        <w:t xml:space="preserve">на </w:t>
-      </w:r>
-      <w:proofErr w:type="spellStart"/>
-      <w:r>
-        <w:rPr>
-          <w:lang w:val="bg-BG"/>
-        </w:rPr>
-        <w:t>ф</w:t>
+        <w:t>на ф</w:t>
       </w:r>
       <w:r>
         <w:rPr>
@@ -6469,14 +5924,7 @@
         <w:rPr>
           <w:lang w:val="bg-BG"/>
         </w:rPr>
-        <w:t>шборда</w:t>
-      </w:r>
-      <w:proofErr w:type="spellEnd"/>
-      <w:r>
-        <w:rPr>
-          <w:lang w:val="bg-BG"/>
-        </w:rPr>
-        <w:t xml:space="preserve"> на</w:t>
+        <w:t>шборда на</w:t>
       </w:r>
       <w:r>
         <w:rPr>
@@ -7575,16 +7023,8 @@
         <w:rPr>
           <w:lang w:val="bg-BG"/>
         </w:rPr>
-        <w:t xml:space="preserve">получаване на команда – главният модул очаква </w:t>
-      </w:r>
-      <w:proofErr w:type="spellStart"/>
-      <w:r>
-        <w:rPr>
-          <w:lang w:val="bg-BG"/>
-        </w:rPr>
-        <w:t>потвърдение</w:t>
-      </w:r>
-      <w:proofErr w:type="spellEnd"/>
+        <w:t>получаване на команда – главният модул очаква потвърдение</w:t>
+      </w:r>
       <w:r>
         <w:t>,</w:t>
       </w:r>
@@ -7640,6 +7080,67 @@
       </w:pPr>
       <w:r>
         <w:rPr>
+          <w:noProof/>
+        </w:rPr>
+        <w:drawing>
+          <wp:inline distT="0" distB="0" distL="0" distR="0" wp14:anchorId="5E434847" wp14:editId="75ECE6C2">
+            <wp:extent cx="5727700" cy="3723640"/>
+            <wp:effectExtent l="0" t="0" r="6350" b="0"/>
+            <wp:docPr id="2" name="Picture 2"/>
+            <wp:cNvGraphicFramePr>
+              <a:graphicFrameLocks xmlns:a="http://schemas.openxmlformats.org/drawingml/2006/main" noChangeAspect="1"/>
+            </wp:cNvGraphicFramePr>
+            <a:graphic xmlns:a="http://schemas.openxmlformats.org/drawingml/2006/main">
+              <a:graphicData uri="http://schemas.openxmlformats.org/drawingml/2006/picture">
+                <pic:pic xmlns:pic="http://schemas.openxmlformats.org/drawingml/2006/picture">
+                  <pic:nvPicPr>
+                    <pic:cNvPr id="0" name="Picture 6"/>
+                    <pic:cNvPicPr>
+                      <a:picLocks noChangeAspect="1" noChangeArrowheads="1"/>
+                    </pic:cNvPicPr>
+                  </pic:nvPicPr>
+                  <pic:blipFill>
+                    <a:blip r:embed="rId24">
+                      <a:extLst>
+                        <a:ext uri="{28A0092B-C50C-407E-A947-70E740481C1C}">
+                          <a14:useLocalDpi xmlns:a14="http://schemas.microsoft.com/office/drawing/2010/main" val="0"/>
+                        </a:ext>
+                      </a:extLst>
+                    </a:blip>
+                    <a:srcRect/>
+                    <a:stretch>
+                      <a:fillRect/>
+                    </a:stretch>
+                  </pic:blipFill>
+                  <pic:spPr bwMode="auto">
+                    <a:xfrm>
+                      <a:off x="0" y="0"/>
+                      <a:ext cx="5727700" cy="3723640"/>
+                    </a:xfrm>
+                    <a:prstGeom prst="rect">
+                      <a:avLst/>
+                    </a:prstGeom>
+                    <a:noFill/>
+                    <a:ln>
+                      <a:noFill/>
+                    </a:ln>
+                  </pic:spPr>
+                </pic:pic>
+              </a:graphicData>
+            </a:graphic>
+          </wp:inline>
+        </w:drawing>
+      </w:r>
+    </w:p>
+    <w:p>
+      <w:pPr>
+        <w:jc w:val="center"/>
+        <w:rPr>
+          <w:lang w:val="bg-BG"/>
+        </w:rPr>
+      </w:pPr>
+      <w:r>
+        <w:rPr>
           <w:lang w:val="bg-BG"/>
         </w:rPr>
         <w:t>Фиг</w:t>
@@ -7657,8 +7158,126 @@
         <w:rPr>
           <w:lang w:val="bg-BG"/>
         </w:rPr>
-        <w:t>схема на работа</w:t>
-      </w:r>
+        <w:t>алгоритъм на командния модул</w:t>
+      </w:r>
+    </w:p>
+    <w:p>
+      <w:pPr>
+        <w:jc w:val="center"/>
+        <w:rPr>
+          <w:lang w:val="bg-BG"/>
+        </w:rPr>
+      </w:pPr>
+      <w:r>
+        <w:rPr>
+          <w:noProof/>
+        </w:rPr>
+        <w:drawing>
+          <wp:inline distT="0" distB="0" distL="0" distR="0" wp14:anchorId="0C85EBC2" wp14:editId="0A5A564B">
+            <wp:extent cx="4601210" cy="1828800"/>
+            <wp:effectExtent l="0" t="0" r="8890" b="0"/>
+            <wp:docPr id="3" name="Picture 3"/>
+            <wp:cNvGraphicFramePr>
+              <a:graphicFrameLocks xmlns:a="http://schemas.openxmlformats.org/drawingml/2006/main" noChangeAspect="1"/>
+            </wp:cNvGraphicFramePr>
+            <a:graphic xmlns:a="http://schemas.openxmlformats.org/drawingml/2006/main">
+              <a:graphicData uri="http://schemas.openxmlformats.org/drawingml/2006/picture">
+                <pic:pic xmlns:pic="http://schemas.openxmlformats.org/drawingml/2006/picture">
+                  <pic:nvPicPr>
+                    <pic:cNvPr id="0" name="Picture 8"/>
+                    <pic:cNvPicPr>
+                      <a:picLocks noChangeAspect="1" noChangeArrowheads="1"/>
+                    </pic:cNvPicPr>
+                  </pic:nvPicPr>
+                  <pic:blipFill>
+                    <a:blip r:embed="rId25">
+                      <a:extLst>
+                        <a:ext uri="{28A0092B-C50C-407E-A947-70E740481C1C}">
+                          <a14:useLocalDpi xmlns:a14="http://schemas.microsoft.com/office/drawing/2010/main" val="0"/>
+                        </a:ext>
+                      </a:extLst>
+                    </a:blip>
+                    <a:srcRect/>
+                    <a:stretch>
+                      <a:fillRect/>
+                    </a:stretch>
+                  </pic:blipFill>
+                  <pic:spPr bwMode="auto">
+                    <a:xfrm>
+                      <a:off x="0" y="0"/>
+                      <a:ext cx="4601210" cy="1828800"/>
+                    </a:xfrm>
+                    <a:prstGeom prst="rect">
+                      <a:avLst/>
+                    </a:prstGeom>
+                    <a:noFill/>
+                    <a:ln>
+                      <a:noFill/>
+                    </a:ln>
+                  </pic:spPr>
+                </pic:pic>
+              </a:graphicData>
+            </a:graphic>
+          </wp:inline>
+        </w:drawing>
+      </w:r>
+    </w:p>
+    <w:p>
+      <w:pPr>
+        <w:jc w:val="center"/>
+        <w:rPr>
+          <w:lang w:val="bg-BG"/>
+        </w:rPr>
+      </w:pPr>
+      <w:r>
+        <w:rPr>
+          <w:lang w:val="bg-BG"/>
+        </w:rPr>
+        <w:t>Фиг</w:t>
+      </w:r>
+      <w:r>
+        <w:t>. 1</w:t>
+      </w:r>
+      <w:r>
+        <w:rPr>
+          <w:lang w:val="bg-BG"/>
+        </w:rPr>
+        <w:t>1</w:t>
+      </w:r>
+      <w:r>
+        <w:rPr>
+          <w:lang w:val="bg-BG"/>
+        </w:rPr>
+        <w:t xml:space="preserve"> алгоритъм на </w:t>
+      </w:r>
+      <w:r>
+        <w:rPr>
+          <w:lang w:val="bg-BG"/>
+        </w:rPr>
+        <w:t xml:space="preserve">изпълнителния </w:t>
+      </w:r>
+      <w:r>
+        <w:rPr>
+          <w:lang w:val="bg-BG"/>
+        </w:rPr>
+        <w:t>модул</w:t>
+      </w:r>
+    </w:p>
+    <w:p>
+      <w:pPr>
+        <w:jc w:val="center"/>
+        <w:rPr>
+          <w:lang w:val="bg-BG"/>
+        </w:rPr>
+      </w:pPr>
+    </w:p>
+    <w:p>
+      <w:pPr>
+        <w:jc w:val="center"/>
+        <w:rPr>
+          <w:lang w:val="bg-BG"/>
+        </w:rPr>
+      </w:pPr>
     </w:p>
     <w:p>
       <w:r>
@@ -7667,6 +7286,7 @@
           <w:bCs/>
           <w:lang w:val="bg-BG"/>
         </w:rPr>
+        <w:lastRenderedPageBreak/>
         <w:t xml:space="preserve">Себестойност на проекта </w:t>
       </w:r>
     </w:p>
@@ -7703,15 +7323,7 @@
         <w:t xml:space="preserve"> </w:t>
       </w:r>
       <w:r>
-        <w:t xml:space="preserve">35-45 </w:t>
-      </w:r>
-      <w:proofErr w:type="spellStart"/>
-      <w:r>
-        <w:t>лв</w:t>
-      </w:r>
-      <w:proofErr w:type="spellEnd"/>
-      <w:r>
-        <w:t>.</w:t>
+        <w:t>35-45 лв.</w:t>
       </w:r>
     </w:p>
     <w:p>
@@ -7743,14 +7355,12 @@
       <w:r>
         <w:t xml:space="preserve"> </w:t>
       </w:r>
-      <w:proofErr w:type="spellStart"/>
       <w:r>
         <w:rPr>
           <w:lang w:val="bg-BG"/>
         </w:rPr>
         <w:t>лв</w:t>
       </w:r>
-      <w:proofErr w:type="spellEnd"/>
       <w:r>
         <w:t>.</w:t>
       </w:r>
@@ -7773,16 +7383,8 @@
         <w:rPr>
           <w:lang w:val="bg-BG"/>
         </w:rPr>
-        <w:t xml:space="preserve"> </w:t>
-      </w:r>
-      <w:proofErr w:type="spellStart"/>
-      <w:r>
-        <w:rPr>
-          <w:lang w:val="bg-BG"/>
-        </w:rPr>
-        <w:t>лв</w:t>
-      </w:r>
-      <w:proofErr w:type="spellEnd"/>
+        <w:t xml:space="preserve"> лв</w:t>
+      </w:r>
       <w:r>
         <w:t>.</w:t>
       </w:r>
@@ -7796,15 +7398,7 @@
         </w:rPr>
       </w:pPr>
       <w:r>
-        <w:t>-Solid-state(DC-</w:t>
-      </w:r>
-      <w:proofErr w:type="spellStart"/>
-      <w:r>
-        <w:t>to_DC</w:t>
-      </w:r>
-      <w:proofErr w:type="spellEnd"/>
-      <w:r>
-        <w:t xml:space="preserve">) </w:t>
+        <w:t xml:space="preserve">-Solid-state(DC-to_DC) </w:t>
       </w:r>
       <w:r>
         <w:rPr>
@@ -8011,7 +7605,7 @@
       </w:r>
     </w:p>
     <w:sectPr>
-      <w:footerReference w:type="default" r:id="rId24"/>
+      <w:footerReference w:type="default" r:id="rId26"/>
       <w:pgSz w:w="12240" w:h="15840"/>
       <w:pgMar w:top="720" w:right="720" w:bottom="720" w:left="720" w:header="720" w:footer="720" w:gutter="0"/>
       <w:cols w:space="720"/>

</xml_diff>